<commit_message>
feat: add blurred green landscape backdrop
</commit_message>
<xml_diff>
--- a/docs/绿色版网站说明.docx
+++ b/docs/绿色版网站说明.docx
@@ -71,6 +71,14 @@
       </w:pPr>
       <w:r>
         <w:t>首页增加 3 张绿色风景图片：森林、湖泊山谷和绿色草地。</w:t>
+      </w:r>
+    </w:p>
+    <w:p>
+      <w:pPr>
+        <w:pStyle w:val="ListBullet"/>
+      </w:pPr>
+      <w:r>
+        <w:t>森林图片作为全站固定背景，经过模糊、低透明度和顶部到底部渐隐处理。</w:t>
       </w:r>
     </w:p>
     <w:p>
@@ -185,7 +193,7 @@
               <a:graphicData uri="http://schemas.openxmlformats.org/drawingml/2006/picture">
                 <pic:pic>
                   <pic:nvPicPr>
-                    <pic:cNvPr id="0" name="preview-home-v3.png"/>
+                    <pic:cNvPr id="0" name="preview-home-v4.png"/>
                     <pic:cNvPicPr/>
                   </pic:nvPicPr>
                   <pic:blipFill>
@@ -232,7 +240,7 @@
               <a:graphicData uri="http://schemas.openxmlformats.org/drawingml/2006/picture">
                 <pic:pic>
                   <pic:nvPicPr>
-                    <pic:cNvPr id="0" name="preview-dashboard-v3.png"/>
+                    <pic:cNvPr id="0" name="preview-dashboard-v4.png"/>
                     <pic:cNvPicPr/>
                   </pic:nvPicPr>
                   <pic:blipFill>

</xml_diff>